<commit_message>
updated at Mon Mar  2 16:32:03 IST 2026
</commit_message>
<xml_diff>
--- a/LinearAlgebra_WinterSpring_2026/CourseOutline copy.docx
+++ b/LinearAlgebra_WinterSpring_2026/CourseOutline copy.docx
@@ -1498,13 +1498,7 @@
           <w:rPr>
             <w:rFonts w:ascii="Cambria Math" w:hAnsi="Cambria Math"/>
           </w:rPr>
-          <m:t>=2</m:t>
-        </m:r>
-        <m:r>
-          <w:rPr>
-            <w:rFonts w:ascii="Cambria Math" w:hAnsi="Cambria Math"/>
-          </w:rPr>
-          <m:t>6</m:t>
+          <m:t>=26</m:t>
         </m:r>
       </m:oMath>
       <w:r>
@@ -1660,25 +1654,7 @@
             <w:rPr>
               <w:rFonts w:ascii="Cambria Math" w:hAnsi="Cambria Math"/>
             </w:rPr>
-            <m:t>6</m:t>
-          </m:r>
-          <m:r>
-            <w:rPr>
-              <w:rFonts w:ascii="Cambria Math" w:hAnsi="Cambria Math"/>
-            </w:rPr>
-            <m:t>= 7</m:t>
-          </m:r>
-          <m:r>
-            <w:rPr>
-              <w:rFonts w:ascii="Cambria Math" w:hAnsi="Cambria Math"/>
-            </w:rPr>
-            <m:t>5</m:t>
-          </m:r>
-          <m:r>
-            <w:rPr>
-              <w:rFonts w:ascii="Cambria Math" w:hAnsi="Cambria Math"/>
-            </w:rPr>
-            <m:t>.5825</m:t>
+            <m:t>6= 75.5825</m:t>
           </m:r>
         </m:oMath>
       </m:oMathPara>
@@ -2560,6 +2536,21 @@
                 <w:lang w:val="en-GB"/>
               </w:rPr>
               <w:t>Ch 9C (Determinant)</w:t>
+            </w:r>
+            <w:r>
+              <w:rPr>
+                <w:rFonts w:eastAsia="Arial"/>
+                <w:lang w:val="en-GB"/>
+              </w:rPr>
+              <w:t xml:space="preserve"> + </w:t>
+            </w:r>
+            <w:r>
+              <w:rPr>
+                <w:rFonts w:eastAsia="Arial"/>
+                <w:lang w:val="en-GB"/>
+              </w:rPr>
+              <w:br/>
+              <w:t>§ 4.4 from Gilbert Strand</w:t>
             </w:r>
           </w:p>
         </w:tc>
@@ -5064,28 +5055,28 @@
 </file>
 
 <file path=customXml/item1.xml><?xml version="1.0" encoding="utf-8"?>
+<b:Sources xmlns:b="http://schemas.openxmlformats.org/officeDocument/2006/bibliography" xmlns="http://schemas.openxmlformats.org/officeDocument/2006/bibliography" SelectedStyle="/APASixthEditionOfficeOnline.xsl" StyleName="APA" Version="6"/>
+</file>
+
+<file path=customXml/item2.xml><?xml version="1.0" encoding="utf-8"?>
 <go:gDocsCustomXmlDataStorage xmlns:go="http://customooxmlschemas.google.com/" xmlns:r="http://schemas.openxmlformats.org/officeDocument/2006/relationships">
   <go:docsCustomData xmlns:go="http://customooxmlschemas.google.com/" roundtripDataSignature="AMtx7mjTYI4jtZMvJTWzVFSA37m48TEUWQ==">AMUW2mVmO3HiPDCzk96/JoPah+GQYMmTaZfxDgE5sP6lxNhoNn+TIjd5S375pooMBI3hcsfQNEZv8LRi0XSHZPp1TndSDOr9XI5dhyNKX5BvvQyfk8g8O1k=</go:docsCustomData>
 </go:gDocsCustomXmlDataStorage>
 </file>
 
-<file path=customXml/item2.xml><?xml version="1.0" encoding="utf-8"?>
-<b:Sources xmlns:b="http://schemas.openxmlformats.org/officeDocument/2006/bibliography" xmlns="http://schemas.openxmlformats.org/officeDocument/2006/bibliography" SelectedStyle="/APASixthEditionOfficeOnline.xsl" StyleName="APA" Version="6"/>
+<file path=customXml/itemProps1.xml><?xml version="1.0" encoding="utf-8"?>
+<ds:datastoreItem xmlns:ds="http://schemas.openxmlformats.org/officeDocument/2006/customXml" ds:itemID="{77AD3D1A-029C-914A-850E-9F8553F6CA0E}">
+  <ds:schemaRefs>
+    <ds:schemaRef ds:uri="http://schemas.openxmlformats.org/officeDocument/2006/bibliography"/>
+  </ds:schemaRefs>
+</ds:datastoreItem>
 </file>
 
-<file path=customXml/itemProps1.xml><?xml version="1.0" encoding="utf-8"?>
+<file path=customXml/itemProps2.xml><?xml version="1.0" encoding="utf-8"?>
 <ds:datastoreItem xmlns:ds="http://schemas.openxmlformats.org/officeDocument/2006/customXml" ds:itemID="{11111111-1234-1234-1234-123412341234}">
   <ds:schemaRefs>
     <ds:schemaRef ds:uri="http://customooxmlschemas.google.com/"/>
     <ds:schemaRef ds:uri="http://schemas.openxmlformats.org/officeDocument/2006/relationships"/>
   </ds:schemaRefs>
 </ds:datastoreItem>
-</file>
-
-<file path=customXml/itemProps2.xml><?xml version="1.0" encoding="utf-8"?>
-<ds:datastoreItem xmlns:ds="http://schemas.openxmlformats.org/officeDocument/2006/customXml" ds:itemID="{77AD3D1A-029C-914A-850E-9F8553F6CA0E}">
-  <ds:schemaRefs>
-    <ds:schemaRef ds:uri="http://schemas.openxmlformats.org/officeDocument/2006/bibliography"/>
-  </ds:schemaRefs>
-</ds:datastoreItem>
 </file>
</xml_diff>